<commit_message>
feat(enterprise): subscription foundations + revised Continuité pricing
Docs (pricing study + brochure):
- Plan Continuité repriced to 10 000 F/véhicule/mois (paliers dégressifs 10/8/6 K)
- Continuité now REPLACES Pro Flotte (single subscription, not a cumulative add-on)
- Revenue modeling, scenarios and conversion levers updated accordingly

Codebase (Phase 1 fondations subscription, manual admin activation, no payment):
- Prisma: EnterpriseSubscription + EnterpriseSubscriptionEvent + 4 enums
- Migration 20260527_enterprise_subscriptions
- Zod validators (create/update subscription)
- subscription.service: paliers Pro Flotte (5/4/3 K) + Continuité (10/8/6 K),
  tier hierarchy helper (CONTINUITE > PRO_FLOTTE > FREE), trial 30j, audit events
- Admin routes: GET /enterprises/:id/subscriptions, POST/PATCH for activation
- 22 new tests covering paliers, gating, trial expiry, status transitions

Co-Authored-By: Claude Opus 4.7 (1M context) <noreply@anthropic.com>
</commit_message>
<xml_diff>
--- a/docs/brochure-commerciale-entreprises-2026-05-27.docx
+++ b/docs/brochure-commerciale-entreprises-2026-05-27.docx
@@ -164,7 +164,7 @@
               <w:pStyle w:val="Compact"/>
             </w:pPr>
             <w:r>
-              <w:t xml:space="preserve">Pro Flotte + 10 000 F / mois forfait flotte</w:t>
+              <w:t xml:space="preserve">10 000 F / véhicule / mois</w:t>
             </w:r>
           </w:p>
         </w:tc>
@@ -220,13 +220,13 @@
           <w:b/>
           <w:bCs/>
         </w:rPr>
-        <w:t xml:space="preserve">Plan Continuité inclut systématiquement toutes les fonctionnalités de Pro Flotte</w:t>
+        <w:t xml:space="preserve">Plan Continuité inclut intégralement Pro Flotte</w:t>
       </w:r>
       <w:r>
         <w:t xml:space="preserve"> </w:t>
       </w:r>
       <w:r>
-        <w:t xml:space="preserve">: c'est une extension d'urgence pour les flottes qui ne peuvent pas se permettre une immobilisation. Vous pouvez aussi rester en gratuit aussi longtemps que vous voulez — pas de gating par taille de flotte.</w:t>
+        <w:t xml:space="preserve">: c'est un abonnement unique à 10 000 F/véhicule/mois (paliers dégressifs identiques à Pro Flotte) qui ajoute la couche urgence — pas un cumul. Vous pouvez aussi rester en gratuit aussi longtemps que vous voulez — pas de gating par taille de flotte.</w:t>
       </w:r>
     </w:p>
     <w:bookmarkEnd w:id="20"/>
@@ -1053,13 +1053,13 @@
       </w:r>
     </w:p>
     <w:bookmarkEnd w:id="29"/>
-    <w:bookmarkStart w:id="30" w:name="X57ec40bd4c721c8584948e25894b70d0506d89f"/>
+    <w:bookmarkStart w:id="30" w:name="X4470e848c0f53631fbc22f484a2e7f49b047dc3"/>
     <w:p>
       <w:pPr>
         <w:pStyle w:val="Heading2"/>
       </w:pPr>
       <w:r>
-        <w:t xml:space="preserve">Niveau 3 — Plan Continuité · Pro Flotte + 10 000 F / mois forfait flotte</w:t>
+        <w:t xml:space="preserve">Niveau 3 — Plan Continuité · 10 000 F / véhicule / mois</w:t>
       </w:r>
     </w:p>
     <w:p>
@@ -1109,7 +1109,7 @@
         <w:t xml:space="preserve"> </w:t>
       </w:r>
       <w:r>
-        <w:t xml:space="preserve">: votre abonnement Pro Flotte par véhicule (5 000 F dégressif selon paliers)</w:t>
+        <w:t xml:space="preserve">: un abonnement unique à</w:t>
       </w:r>
       <w:r>
         <w:t xml:space="preserve"> </w:t>
@@ -1119,13 +1119,10 @@
           <w:b/>
           <w:bCs/>
         </w:rPr>
-        <w:t xml:space="preserve">+</w:t>
-      </w:r>
-      <w:r>
-        <w:t xml:space="preserve"> </w:t>
-      </w:r>
-      <w:r>
-        <w:t xml:space="preserve">10 000 F/mois forfait flotte pour la couche urgence. Exemple flotte 20 véhicules : 100 000 F + 10 000 F =</w:t>
+        <w:t xml:space="preserve">10 000 F / véhicule / mois</w:t>
+      </w:r>
+      <w:r>
+        <w:t xml:space="preserve">, avec les mêmes paliers dégressifs que Pro Flotte (1–20 : 10 000 F ; 21–50 : 8 000 F ; 51–100 : 6 000 F ; 100+ : tarif négocié). Continuité remplace Pro Flotte — vous ne cumulez pas les deux. Exemple flotte 20 véhicules :</w:t>
       </w:r>
       <w:r>
         <w:t xml:space="preserve"> </w:t>
@@ -1135,10 +1132,10 @@
           <w:b/>
           <w:bCs/>
         </w:rPr>
-        <w:t xml:space="preserve">110 000 F/mois tout compris</w:t>
-      </w:r>
-      <w:r>
-        <w:t xml:space="preserve">.</w:t>
+        <w:t xml:space="preserve">200 000 F/mois tout compris</w:t>
+      </w:r>
+      <w:r>
+        <w:t xml:space="preserve">, vs 100 000 F en Pro Flotte seul.</w:t>
       </w:r>
     </w:p>
     <w:bookmarkEnd w:id="30"/>

</xml_diff>

<commit_message>
feat(enterprise): flat per-vehicle pricing + rename Plan Continuité → Flotte Pro +
Pricing:
- Flat per-vehicle pricing only: Flotte Pro 5 000 F/véh/mois, Flotte Pro + 10 000 F/véh/mois
- Remove all paliers dégressifs (study + brochure + code + tests)
- Rename Plan Continuité → Flotte Pro + everywhere
- Rename Pro Flotte → Flotte Pro (display); Flotte Pro + always includes Flotte Pro

Code:
- Prisma SubscriptionTier enum: CONTINUITE → PRO_FLOTTE_PLUS (migration updated)
- subscription.service: PRICE_PER_VEHICLE flat record, no paliers
- Tests rewritten: prix flat, hiérarchie PRO_FLOTTE_PLUS > PRO_FLOTTE > FREE
- Docs regenerated (PDF + DOCX)

Co-Authored-By: Claude Opus 4.7 (1M context) <noreply@anthropic.com>
</commit_message>
<xml_diff>
--- a/docs/brochure-commerciale-entreprises-2026-05-27.docx
+++ b/docs/brochure-commerciale-entreprises-2026-05-27.docx
@@ -2,7 +2,7 @@
 <file path=word/document.xml><?xml version="1.0" encoding="utf-8"?>
 <w:document xmlns:w="http://schemas.openxmlformats.org/wordprocessingml/2006/main" xmlns:m="http://schemas.openxmlformats.org/officeDocument/2006/math" xmlns:r="http://schemas.openxmlformats.org/officeDocument/2006/relationships" xmlns:o="urn:schemas-microsoft-com:office:office" xmlns:v="urn:schemas-microsoft-com:vml" xmlns:w10="urn:schemas-microsoft-com:office:word" xmlns:a="http://schemas.openxmlformats.org/drawingml/2006/main" xmlns:pic="http://schemas.openxmlformats.org/drawingml/2006/picture" xmlns:wp="http://schemas.openxmlformats.org/drawingml/2006/wordprocessingDrawing">
   <w:body>
-    <w:bookmarkStart w:id="45" w:name="pièces-entreprises--brochure-commerciale"/>
+    <w:bookmarkStart w:id="44" w:name="pièces-entreprises--brochure-commerciale"/>
     <w:p>
       <w:pPr>
         <w:pStyle w:val="Heading1"/>
@@ -16,7 +16,7 @@
         <w:pStyle w:val="FirstParagraph"/>
       </w:pPr>
       <w:r>
-        <w:t xml:space="preserve">Édition de mai 2026 — packaging Pro Flotte à trois niveaux</w:t>
+        <w:t xml:space="preserve">Édition de mai 2026 — packaging Flotte Pro à trois niveaux</w:t>
       </w:r>
     </w:p>
     <w:p>
@@ -83,18 +83,18 @@
               <w:pStyle w:val="Compact"/>
             </w:pPr>
             <w:r>
-              <w:t xml:space="preserve">PRO FLOTTE</w:t>
-            </w:r>
-          </w:p>
-        </w:tc>
-        <w:tc>
-          <w:tcPr/>
-          <w:p>
-            <w:pPr>
-              <w:pStyle w:val="Compact"/>
-            </w:pPr>
-            <w:r>
-              <w:t xml:space="preserve">PLAN CONTINUITÉ</w:t>
+              <w:t xml:space="preserve">FLOTTE PRO</w:t>
+            </w:r>
+          </w:p>
+        </w:tc>
+        <w:tc>
+          <w:tcPr/>
+          <w:p>
+            <w:pPr>
+              <w:pStyle w:val="Compact"/>
+            </w:pPr>
+            <w:r>
+              <w:t xml:space="preserve">FLOTTE PRO +</w:t>
             </w:r>
           </w:p>
         </w:tc>
@@ -118,18 +118,18 @@
               <w:pStyle w:val="Compact"/>
             </w:pPr>
             <w:r>
-              <w:t xml:space="preserve">Pièces Pro Flotte</w:t>
-            </w:r>
-          </w:p>
-        </w:tc>
-        <w:tc>
-          <w:tcPr/>
-          <w:p>
-            <w:pPr>
-              <w:pStyle w:val="Compact"/>
-            </w:pPr>
-            <w:r>
-              <w:t xml:space="preserve">Plan Continuité</w:t>
+              <w:t xml:space="preserve">Pièces Flotte Pro</w:t>
+            </w:r>
+          </w:p>
+        </w:tc>
+        <w:tc>
+          <w:tcPr/>
+          <w:p>
+            <w:pPr>
+              <w:pStyle w:val="Compact"/>
+            </w:pPr>
+            <w:r>
+              <w:t xml:space="preserve">Pièces Flotte Pro +</w:t>
             </w:r>
           </w:p>
         </w:tc>
@@ -199,7 +199,7 @@
               <w:pStyle w:val="Compact"/>
             </w:pPr>
             <w:r>
-              <w:t xml:space="preserve">Tout Pro Flotte + ne perdez plus une journée. SLA monétisé, livraisons 3 h chrono, assistance dédiée.</w:t>
+              <w:t xml:space="preserve">Tout Flotte Pro + ne perdez plus une journée. SLA monétisé, livraisons 3 h chrono, assistance dédiée.</w:t>
             </w:r>
           </w:p>
         </w:tc>
@@ -210,7 +210,7 @@
         <w:pStyle w:val="BodyText"/>
       </w:pPr>
       <w:r>
-        <w:t xml:space="preserve">Pro Flotte et Continuité se choisissent selon votre besoin. Le</w:t>
+        <w:t xml:space="preserve">Flotte Pro et Flotte Pro + se choisissent selon votre besoin.</w:t>
       </w:r>
       <w:r>
         <w:t xml:space="preserve"> </w:t>
@@ -220,13 +220,13 @@
           <w:b/>
           <w:bCs/>
         </w:rPr>
-        <w:t xml:space="preserve">Plan Continuité inclut intégralement Pro Flotte</w:t>
+        <w:t xml:space="preserve">Flotte Pro + inclut intégralement Flotte Pro</w:t>
       </w:r>
       <w:r>
         <w:t xml:space="preserve"> </w:t>
       </w:r>
       <w:r>
-        <w:t xml:space="preserve">: c'est un abonnement unique à 10 000 F/véhicule/mois (paliers dégressifs identiques à Pro Flotte) qui ajoute la couche urgence — pas un cumul. Vous pouvez aussi rester en gratuit aussi longtemps que vous voulez — pas de gating par taille de flotte.</w:t>
+        <w:t xml:space="preserve">: c'est un abonnement unique à 10 000 F/véhicule/mois (prix flat, pas de paliers) qui ajoute la couche urgence — pas un cumul. Vous pouvez aussi rester en gratuit aussi longtemps que vous voulez — pas de gating par taille de flotte.</w:t>
       </w:r>
     </w:p>
     <w:bookmarkEnd w:id="20"/>
@@ -504,13 +504,13 @@
       </w:r>
     </w:p>
     <w:bookmarkEnd w:id="24"/>
-    <w:bookmarkStart w:id="25" w:name="X99e74b43e643ce02a3b2dfb351a192187f060a4"/>
+    <w:bookmarkStart w:id="25" w:name="Xc7b10058a9f2b50cc73ad6343568821fe635c83"/>
     <w:p>
       <w:pPr>
         <w:pStyle w:val="Heading2"/>
       </w:pPr>
       <w:r>
-        <w:t xml:space="preserve">Niveau 2 — Pièces Pro Flotte · 5 000 F / véhicule / mois</w:t>
+        <w:t xml:space="preserve">Niveau 2 — Pièces Flotte Pro · 5 000 F / véhicule / mois</w:t>
       </w:r>
     </w:p>
     <w:p>
@@ -796,7 +796,7 @@
         <w:pStyle w:val="FirstParagraph"/>
       </w:pPr>
       <w:r>
-        <w:t xml:space="preserve">Le ROI de Pro Flotte, en clair</w:t>
+        <w:t xml:space="preserve">Le ROI de Flotte Pro, en clair</w:t>
       </w:r>
     </w:p>
     <w:tbl>
@@ -834,7 +834,7 @@
               <w:pStyle w:val="Compact"/>
             </w:pPr>
             <w:r>
-              <w:t xml:space="preserve">Pro Flotte 600 000 F</w:t>
+              <w:t xml:space="preserve">Flotte Pro 600 000 F</w:t>
             </w:r>
           </w:p>
         </w:tc>
@@ -1049,17 +1049,17 @@
         <w:pStyle w:val="BodyText"/>
       </w:pPr>
       <w:r>
-        <w:t xml:space="preserve">Pour une flotte de 50 véhicules, l'abonnement Pro Flotte est remboursé en 3 semaines d'économies pièces. À 100 véhicules, c'est moins de 2 semaines. Le reste de l'année est marge positive.</w:t>
+        <w:t xml:space="preserve">Pour une flotte de 50 véhicules, l'abonnement Flotte Pro est remboursé en 3 semaines d'économies pièces. À 100 véhicules, c'est moins de 2 semaines. Le reste de l'année est marge positive.</w:t>
       </w:r>
     </w:p>
     <w:bookmarkEnd w:id="29"/>
-    <w:bookmarkStart w:id="30" w:name="X4470e848c0f53631fbc22f484a2e7f49b047dc3"/>
+    <w:bookmarkStart w:id="30" w:name="X2d9bbf2e3a496e6809cbe0c659111b4bf6afb0a"/>
     <w:p>
       <w:pPr>
         <w:pStyle w:val="Heading2"/>
       </w:pPr>
       <w:r>
-        <w:t xml:space="preserve">Niveau 3 — Plan Continuité · 10 000 F / véhicule / mois</w:t>
+        <w:t xml:space="preserve">Niveau 3 — Pièces Flotte Pro + · 10 000 F / véhicule / mois</w:t>
       </w:r>
     </w:p>
     <w:p>
@@ -1067,7 +1067,7 @@
         <w:pStyle w:val="FirstParagraph"/>
       </w:pPr>
       <w:r>
-        <w:t xml:space="preserve">« Tout Pro Flotte, et ne perdez plus une journée. »</w:t>
+        <w:t xml:space="preserve">« Tout Flotte Pro, et ne perdez plus une journée. »</w:t>
       </w:r>
     </w:p>
     <w:p>
@@ -1075,7 +1075,7 @@
         <w:pStyle w:val="BodyText"/>
       </w:pPr>
       <w:r>
-        <w:t xml:space="preserve">Le Plan Continuité</w:t>
+        <w:t xml:space="preserve">Flotte Pro +</w:t>
       </w:r>
       <w:r>
         <w:t xml:space="preserve"> </w:t>
@@ -1085,7 +1085,7 @@
           <w:b/>
           <w:bCs/>
         </w:rPr>
-        <w:t xml:space="preserve">inclut intégralement Pro Flotte</w:t>
+        <w:t xml:space="preserve">inclut intégralement Flotte Pro</w:t>
       </w:r>
       <w:r>
         <w:t xml:space="preserve"> </w:t>
@@ -1122,7 +1122,7 @@
         <w:t xml:space="preserve">10 000 F / véhicule / mois</w:t>
       </w:r>
       <w:r>
-        <w:t xml:space="preserve">, avec les mêmes paliers dégressifs que Pro Flotte (1–20 : 10 000 F ; 21–50 : 8 000 F ; 51–100 : 6 000 F ; 100+ : tarif négocié). Continuité remplace Pro Flotte — vous ne cumulez pas les deux. Exemple flotte 20 véhicules :</w:t>
+        <w:t xml:space="preserve">, prix flat (pas de paliers). Flotte Pro + remplace Flotte Pro — vous ne cumulez pas les deux. Exemple flotte 20 véhicules :</w:t>
       </w:r>
       <w:r>
         <w:t xml:space="preserve"> </w:t>
@@ -1135,7 +1135,7 @@
         <w:t xml:space="preserve">200 000 F/mois tout compris</w:t>
       </w:r>
       <w:r>
-        <w:t xml:space="preserve">, vs 100 000 F en Pro Flotte seul.</w:t>
+        <w:t xml:space="preserve">, vs 100 000 F en Flotte Pro seul.</w:t>
       </w:r>
     </w:p>
     <w:bookmarkEnd w:id="30"/>
@@ -1301,10 +1301,10 @@
           <w:b/>
           <w:bCs/>
         </w:rPr>
-        <w:t xml:space="preserve">Plan Continuité = Pro Flotte + couche urgence</w:t>
-      </w:r>
-      <w:r>
-        <w:t xml:space="preserve">, donc toute fonctionnalité Pro Flotte est aussi disponible en Continuité.</w:t>
+        <w:t xml:space="preserve">Flotte Pro + = Flotte Pro + couche urgence</w:t>
+      </w:r>
+      <w:r>
+        <w:t xml:space="preserve">, donc toute fonctionnalité Flotte Pro est aussi disponible en Flotte Pro +.</w:t>
       </w:r>
     </w:p>
     <w:tbl>
@@ -1352,18 +1352,18 @@
               <w:pStyle w:val="Compact"/>
             </w:pPr>
             <w:r>
-              <w:t xml:space="preserve">Pro Flotte</w:t>
-            </w:r>
-          </w:p>
-        </w:tc>
-        <w:tc>
-          <w:tcPr/>
-          <w:p>
-            <w:pPr>
-              <w:pStyle w:val="Compact"/>
-            </w:pPr>
-            <w:r>
-              <w:t xml:space="preserve">Plan Continuité</w:t>
+              <w:t xml:space="preserve">Flotte Pro</w:t>
+            </w:r>
+          </w:p>
+        </w:tc>
+        <w:tc>
+          <w:tcPr/>
+          <w:p>
+            <w:pPr>
+              <w:pStyle w:val="Compact"/>
+            </w:pPr>
+            <w:r>
+              <w:t xml:space="preserve">Flotte Pro +</w:t>
             </w:r>
           </w:p>
         </w:tc>
@@ -2953,13 +2953,13 @@
       </w:r>
     </w:p>
     <w:bookmarkEnd w:id="34"/>
-    <w:bookmarkStart w:id="35" w:name="essai-30-jours-sur-pro-flotte"/>
+    <w:bookmarkStart w:id="35" w:name="essai-30-jours-sur-flotte-pro"/>
     <w:p>
       <w:pPr>
         <w:pStyle w:val="Heading2"/>
       </w:pPr>
       <w:r>
-        <w:t xml:space="preserve">Essai 30 jours sur Pro Flotte</w:t>
+        <w:t xml:space="preserve">Essai 30 jours sur Flotte Pro</w:t>
       </w:r>
     </w:p>
     <w:p>
@@ -2967,7 +2967,7 @@
         <w:pStyle w:val="FirstParagraph"/>
       </w:pPr>
       <w:r>
-        <w:t xml:space="preserve">À l'inscription, toutes les fonctionnalités Pro Flotte sont activées 30 jours gratuitement et sans engagement. Vous voyez la valeur avant de décider. À J+30, vous choisissez : continuer avec Pro Flotte, ou repasser sur le niveau gratuit.</w:t>
+        <w:t xml:space="preserve">À l'inscription, toutes les fonctionnalités Flotte Pro sont activées 30 jours gratuitement et sans engagement. Vous voyez la valeur avant de décider. À J+30, vous choisissez : continuer avec Flotte Pro, ou repasser sur le niveau gratuit.</w:t>
       </w:r>
     </w:p>
     <w:bookmarkEnd w:id="35"/>
@@ -2985,17 +2985,17 @@
         <w:pStyle w:val="FirstParagraph"/>
       </w:pPr>
       <w:r>
-        <w:t xml:space="preserve">Si à 3 mois Pro Flotte ne vous a pas fait économiser au moins l'équivalent de l'abonnement, vous repassez en gratuit et nous vous remboursons la dernière mensualité. Nous prenons le risque.</w:t>
+        <w:t xml:space="preserve">Si à 3 mois Flotte Pro ne vous a pas fait économiser au moins l'équivalent de l'abonnement, vous repassez en gratuit et nous vous remboursons la dernière mensualité. Nous prenons le risque.</w:t>
       </w:r>
     </w:p>
     <w:bookmarkEnd w:id="36"/>
-    <w:bookmarkStart w:id="37" w:name="pricing-dégressif-par-paliers"/>
+    <w:bookmarkStart w:id="37" w:name="paiement-annuel--2-mois-offerts"/>
     <w:p>
       <w:pPr>
         <w:pStyle w:val="Heading2"/>
       </w:pPr>
       <w:r>
-        <w:t xml:space="preserve">Pricing dégressif par paliers</w:t>
+        <w:t xml:space="preserve">Paiement annuel = 2 mois offerts</w:t>
       </w:r>
     </w:p>
     <w:p>
@@ -3003,7 +3003,43 @@
         <w:pStyle w:val="FirstParagraph"/>
       </w:pPr>
       <w:r>
-        <w:t xml:space="preserve">1 à 20 véhicules 5 000 F</w:t>
+        <w:t xml:space="preserve">Payer Flotte Pro annuellement d'avance vous fait gagner l'équivalent de 2 mois (16,7 % de remise effective). Cash up-front pour vous, prévisibilité pour nous. Idéal pour les services administratifs et les flottes structurées.</w:t>
+      </w:r>
+    </w:p>
+    <w:bookmarkEnd w:id="37"/>
+    <w:bookmarkStart w:id="38" w:name="calculateur-roi-à-linscription"/>
+    <w:p>
+      <w:pPr>
+        <w:pStyle w:val="Heading2"/>
+      </w:pPr>
+      <w:r>
+        <w:t xml:space="preserve">Calculateur ROI à l'inscription</w:t>
+      </w:r>
+    </w:p>
+    <w:p>
+      <w:pPr>
+        <w:pStyle w:val="FirstParagraph"/>
+      </w:pPr>
+      <w:r>
+        <w:t xml:space="preserve">Avant même de saisir vos véhicules, indiquez votre budget pièces annuel. Pièces calcule en temps réel l'économie projetée, le coût Flotte Pro (5 000 F × véhicules), et le ROI net. La décision devient une évidence arithmétique.</w:t>
+      </w:r>
+    </w:p>
+    <w:bookmarkEnd w:id="38"/>
+    <w:bookmarkStart w:id="39" w:name="Xeebc77e62dcf2cba9b5883dcd894e79cee7f8b4"/>
+    <w:p>
+      <w:pPr>
+        <w:pStyle w:val="Heading2"/>
+      </w:pPr>
+      <w:r>
+        <w:t xml:space="preserve">Notre modèle économique, en transparence totale</w:t>
+      </w:r>
+    </w:p>
+    <w:p>
+      <w:pPr>
+        <w:pStyle w:val="FirstParagraph"/>
+      </w:pPr>
+      <w:r>
+        <w:t xml:space="preserve">Commission marketplace Prélevée auprès du fournisseur sur chaque commande (5–10 %). C'est notre revenu de base, présent quel que soit votre niveau.</w:t>
       </w:r>
     </w:p>
     <w:p>
@@ -3011,81 +3047,19 @@
         <w:pStyle w:val="BodyText"/>
       </w:pPr>
       <w:r>
-        <w:t xml:space="preserve">51 à 100 véhicules 3 000 F</w:t>
-      </w:r>
-    </w:p>
-    <w:bookmarkEnd w:id="37"/>
-    <w:bookmarkStart w:id="38" w:name="paiement-annuel--2-mois-offerts"/>
-    <w:p>
-      <w:pPr>
-        <w:pStyle w:val="Heading2"/>
-      </w:pPr>
-      <w:r>
-        <w:t xml:space="preserve">Paiement annuel = 2 mois offerts</w:t>
-      </w:r>
-    </w:p>
-    <w:p>
-      <w:pPr>
-        <w:pStyle w:val="FirstParagraph"/>
-      </w:pPr>
-      <w:r>
-        <w:t xml:space="preserve">Payer Pro Flotte annuellement d'avance vous fait gagner l'équivalent de 2 mois (16,7 % de remise effective). Cash up-front pour vous, prévisibilité pour nous. Idéal pour les services administratifs et les flottes structurées.</w:t>
-      </w:r>
-    </w:p>
-    <w:bookmarkEnd w:id="38"/>
-    <w:bookmarkStart w:id="39" w:name="calculateur-roi-à-linscription"/>
-    <w:p>
-      <w:pPr>
-        <w:pStyle w:val="Heading2"/>
-      </w:pPr>
-      <w:r>
-        <w:t xml:space="preserve">Calculateur ROI à l'inscription</w:t>
-      </w:r>
-    </w:p>
-    <w:p>
-      <w:pPr>
-        <w:pStyle w:val="FirstParagraph"/>
-      </w:pPr>
-      <w:r>
-        <w:t xml:space="preserve">Avant même de saisir vos véhicules, indiquez votre budget pièces annuel. Pièces calcule en temps réel l'économie projetée, le coût Pro Flotte adapté à votre taille, et le ROI net. La décision devient une évidence arithmétique.</w:t>
+        <w:t xml:space="preserve">Flotte Pro + 10 000 F / véhicule / mois. Couvre les surcoûts logistiques de l'urgence et de l'assistance dédiée.</w:t>
+      </w:r>
+    </w:p>
+    <w:p>
+      <w:pPr>
+        <w:pStyle w:val="BodyText"/>
+      </w:pPr>
+      <w:r>
+        <w:t xml:space="preserve">Pas de marge cachée sur les pièces. Pas de frais d'entrée. Pas de droit de regard sur vos commandes hors plateforme. Notre incitatif est aligné sur le vôtre : plus vous économisez, plus vous restez.</w:t>
       </w:r>
     </w:p>
     <w:bookmarkEnd w:id="39"/>
-    <w:bookmarkStart w:id="40" w:name="Xeebc77e62dcf2cba9b5883dcd894e79cee7f8b4"/>
-    <w:p>
-      <w:pPr>
-        <w:pStyle w:val="Heading2"/>
-      </w:pPr>
-      <w:r>
-        <w:t xml:space="preserve">Notre modèle économique, en transparence totale</w:t>
-      </w:r>
-    </w:p>
-    <w:p>
-      <w:pPr>
-        <w:pStyle w:val="FirstParagraph"/>
-      </w:pPr>
-      <w:r>
-        <w:t xml:space="preserve">Commission marketplace Prélevée auprès du fournisseur sur chaque commande (5–10 %). C'est notre revenu de base, présent quel que soit votre niveau.</w:t>
-      </w:r>
-    </w:p>
-    <w:p>
-      <w:pPr>
-        <w:pStyle w:val="BodyText"/>
-      </w:pPr>
-      <w:r>
-        <w:t xml:space="preserve">Plan Continuité Forfait mensuel flotte. Couvre les surcoûts logistiques de l'urgence et de l'assistance dédiée.</w:t>
-      </w:r>
-    </w:p>
-    <w:p>
-      <w:pPr>
-        <w:pStyle w:val="BodyText"/>
-      </w:pPr>
-      <w:r>
-        <w:t xml:space="preserve">Pas de marge cachée sur les pièces. Pas de frais d'entrée. Pas de droit de regard sur vos commandes hors plateforme. Notre incitatif est aligné sur le vôtre : plus vous économisez, plus vous restez.</w:t>
-      </w:r>
-    </w:p>
-    <w:bookmarkEnd w:id="40"/>
-    <w:bookmarkStart w:id="41" w:name="Xcaf67d62636605794cedd4e9673043a4a88a403"/>
+    <w:bookmarkStart w:id="40" w:name="Xcaf67d62636605794cedd4e9673043a4a88a403"/>
     <w:p>
       <w:pPr>
         <w:pStyle w:val="Heading2"/>
@@ -3138,7 +3112,7 @@
               <w:pStyle w:val="Compact"/>
             </w:pPr>
             <w:r>
-              <w:t xml:space="preserve">Avec Pro Flotte</w:t>
+              <w:t xml:space="preserve">Avec Flotte Pro</w:t>
             </w:r>
           </w:p>
         </w:tc>
@@ -3394,11 +3368,11 @@
         <w:pStyle w:val="BodyText"/>
       </w:pPr>
       <w:r>
-        <w:t xml:space="preserve">Sur 300 M FCFA de budget annuel, l'économie cible est de 60 à 90 M FCFA par an, pour un investissement Pro Flotte de 3,6 M FCFA. Le ROI net minimum est de +56 M FCFA.</w:t>
-      </w:r>
-    </w:p>
-    <w:bookmarkEnd w:id="41"/>
-    <w:bookmarkStart w:id="42" w:name="comment-démarrer"/>
+        <w:t xml:space="preserve">Sur 300 M FCFA de budget annuel, l'économie cible est de 60 à 90 M FCFA par an, pour un investissement Flotte Pro de 6,0 M FCFA (100 véhicules × 5 000 F × 12 mois). Le ROI net minimum est de +54 M FCFA.</w:t>
+      </w:r>
+    </w:p>
+    <w:bookmarkEnd w:id="40"/>
+    <w:bookmarkStart w:id="41" w:name="comment-démarrer"/>
     <w:p>
       <w:pPr>
         <w:pStyle w:val="Heading2"/>
@@ -3440,7 +3414,7 @@
         </w:numPr>
       </w:pPr>
       <w:r>
-        <w:t xml:space="preserve">Activation automatique de l'essai Pro Flotte 30 jours — toutes les fonctionnalités, sans carte bancaire.</w:t>
+        <w:t xml:space="preserve">Activation automatique de l'essai Flotte Pro 30 jours — toutes les fonctionnalités, sans carte bancaire.</w:t>
       </w:r>
     </w:p>
     <w:p>
@@ -3488,11 +3462,11 @@
         </w:numPr>
       </w:pPr>
       <w:r>
-        <w:t xml:space="preserve">À J+30, choisissez : continuer en Pro Flotte, revenir au gratuit, ou ajouter Plan Continuité. Délai moyen de mise en route : 48 h ouvrées.</w:t>
-      </w:r>
-    </w:p>
-    <w:bookmarkEnd w:id="42"/>
-    <w:bookmarkStart w:id="44" w:name="contact"/>
+        <w:t xml:space="preserve">À J+30, choisissez : continuer en Flotte Pro, revenir au gratuit, ou passer en Flotte Pro +. Délai moyen de mise en route : 48 h ouvrées.</w:t>
+      </w:r>
+    </w:p>
+    <w:bookmarkEnd w:id="41"/>
+    <w:bookmarkStart w:id="43" w:name="contact"/>
     <w:p>
       <w:pPr>
         <w:pStyle w:val="Heading2"/>
@@ -3511,7 +3485,7 @@
       <w:r>
         <w:t xml:space="preserve"> </w:t>
       </w:r>
-      <w:hyperlink r:id="rId43">
+      <w:hyperlink r:id="rId42">
         <w:r>
           <w:rPr>
             <w:rStyle w:val="Hyperlink"/>
@@ -3525,11 +3499,11 @@
         <w:pStyle w:val="BodyText"/>
       </w:pPr>
       <w:r>
-        <w:t xml:space="preserve">Brochure éditée à partir du packaging Pro Flotte au 27 mai 2026. Pour les conditions générales d'utilisation, voir pieces.ci/cgu.</w:t>
-      </w:r>
-    </w:p>
+        <w:t xml:space="preserve">Brochure éditée à partir du packaging Flotte Pro au 27 mai 2026. Pour les conditions générales d'utilisation, voir pieces.ci/cgu.</w:t>
+      </w:r>
+    </w:p>
+    <w:bookmarkEnd w:id="43"/>
     <w:bookmarkEnd w:id="44"/>
-    <w:bookmarkEnd w:id="45"/>
     <w:sectPr/>
   </w:body>
 </w:document>

</xml_diff>